<commit_message>
added git experience bullets
</commit_message>
<xml_diff>
--- a/Matthew_Hendricks-CV.docx
+++ b/Matthew_Hendricks-CV.docx
@@ -587,7 +587,7 @@
         <w:rPr>
           <w:rtl w:val="0"/>
         </w:rPr>
-        <w:t xml:space="preserve">Built custom support enhancements for a support team using Zendesk, Salesforce, and custom Ookla API with Javascript, Vue, HTML, CSS.</w:t>
+        <w:t xml:space="preserve">Built custom support enhancements for a support team using Zendesk, Salesforce, and custom Ookla API with Javascript, Vue, HTML, CSS and checked in project updates using Git pull requests.</w:t>
       </w:r>
     </w:p>
     <w:p>
@@ -728,7 +728,7 @@
         <w:rPr>
           <w:rtl w:val="0"/>
         </w:rPr>
-        <w:t xml:space="preserve">Composed release notes for various release management milestones (14 beta, 2 release candidates, and 1 major release version) while prioritizing website updates for consumer-focused technical documentation.</w:t>
+        <w:t xml:space="preserve">Followed code updates in Git repo and composed release notes for various release management milestones (14 beta, 2 release candidates, and 1 major release version) while prioritizing website updates for consumer-focused technical documentation.</w:t>
       </w:r>
     </w:p>
     <w:p>

</xml_diff>